<commit_message>
1.0.0 - declared; organizer guide regenerated by npm run share
Same code as 0.16.4 (D-067). The share guide, Word and text, now comes
from scripts/generate-share-guide.mjs and is stamped with the version.
Next is v1.1, saved rosters first; polish waits for more hands (D-068).

Co-Authored-By: Claude Opus 5.5 <noreply@anthropic.com>
</commit_message>
<xml_diff>
--- a/docs/share/organizer-guide.docx
+++ b/docs/share/organizer-guide.docx
@@ -15,7 +15,7 @@
         <w:spacing w:after="120"/>
       </w:pPr>
       <w:r>
-        <w:t xml:space="preserve">A spinning wheel for Jack &amp; Jill partner draws. Spin for a leader, spin for a follower, then spin a challenge for the couple to dance. No accounts, no ads, and it works with no internet once it is installed.</w:t>
+        <w:t xml:space="preserve">A spinning wheel for Jack &amp; Jill partner draws. Spin for a leader, spin for a follower, then spin a challenge for the couple to dance. For practice nights there is also a Quick list: every pairing at once, no wheel. No accounts, no ads, and it works with no internet once it is installed.</w:t>
       </w:r>
     </w:p>
     <w:p>
@@ -24,6 +24,21 @@
       </w:pPr>
       <w:r>
         <w:t xml:space="preserve">The app lives at: https://gdakota222.github.io/jnj-wheel-spinner/</w:t>
+      </w:r>
+    </w:p>
+    <w:p>
+      <w:pPr>
+        <w:spacing w:after="120"/>
+      </w:pPr>
+      <w:r>
+        <w:rPr>
+          <w:i/>
+          <w:iCs/>
+          <w:color w:val="666666"/>
+          <w:sz w:val="20"/>
+          <w:szCs w:val="20"/>
+        </w:rPr>
+        <w:t xml:space="preserve">Written for version 1.0.0. The version is shown on the title screen.</w:t>
       </w:r>
     </w:p>
     <w:p>
@@ -245,7 +260,167 @@
         <w:spacing w:after="120" w:before="320"/>
       </w:pPr>
       <w:r>
-        <w:t xml:space="preserve">Part 2: Run a night</w:t>
+        <w:t xml:space="preserve">Part 2: Set up a night</w:t>
+      </w:r>
+    </w:p>
+    <w:p>
+      <w:pPr>
+        <w:spacing w:after="120"/>
+      </w:pPr>
+      <w:r>
+        <w:t xml:space="preserve">Tap Start a Session. Setting up has three steps, and you can tap between them at any time.</w:t>
+      </w:r>
+    </w:p>
+    <w:p>
+      <w:pPr>
+        <w:pStyle w:val="ListParagraph"/>
+        <w:numPr>
+          <w:ilvl w:val="0"/>
+          <w:numId w:val="5"/>
+        </w:numPr>
+        <w:spacing w:after="80"/>
+      </w:pPr>
+      <w:r>
+        <w:t xml:space="preserve">How it runs. Choose the Wheel (the show, one couple at a time with the room watching) or the Quick list (practice nights). Turn on Match by division if you want couples kept within a level. On the wheel, choose who is drawn first (leaders, followers, or let the app decide) and whether each couple gets a challenge.</w:t>
+      </w:r>
+    </w:p>
+    <w:p>
+      <w:pPr>
+        <w:pStyle w:val="ListParagraph"/>
+        <w:numPr>
+          <w:ilvl w:val="0"/>
+          <w:numId w:val="5"/>
+        </w:numPr>
+        <w:spacing w:after="80"/>
+      </w:pPr>
+      <w:r>
+        <w:t xml:space="preserve">Dancers. Add everyone and mark each as Leader, Follower or Switch. Switches are shared out to keep both sides even. Names need a last name or initial ("Sarah M"). Use Rename beside a name to fix a typo. With divisions on, pick each dancer's division here.</w:t>
+      </w:r>
+    </w:p>
+    <w:p>
+      <w:pPr>
+        <w:pStyle w:val="ListParagraph"/>
+        <w:numPr>
+          <w:ilvl w:val="0"/>
+          <w:numId w:val="5"/>
+        </w:numPr>
+        <w:spacing w:after="80"/>
+      </w:pPr>
+      <w:r>
+        <w:t xml:space="preserve">Start. Check the summary, then begin. On the wheel, roughly 3 to 10 couples works best and 5 is the sweet spot. A Quick list has no size limit.</w:t>
+      </w:r>
+    </w:p>
+    <w:p>
+      <w:pPr>
+        <w:pStyle w:val="Heading1"/>
+        <w:spacing w:after="120" w:before="320"/>
+      </w:pPr>
+      <w:r>
+        <w:t xml:space="preserve">Part 3: Run it on the wheel</w:t>
+      </w:r>
+    </w:p>
+    <w:p>
+      <w:pPr>
+        <w:pStyle w:val="ListParagraph"/>
+        <w:numPr>
+          <w:ilvl w:val="0"/>
+          <w:numId w:val="4"/>
+        </w:numPr>
+        <w:spacing w:after="80"/>
+      </w:pPr>
+      <w:r>
+        <w:t xml:space="preserve">Tap the wheel to spin. Tap a spinning wheel to hurry it up; double-tap to skip straight to the answer.</w:t>
+      </w:r>
+    </w:p>
+    <w:p>
+      <w:pPr>
+        <w:pStyle w:val="ListParagraph"/>
+        <w:numPr>
+          <w:ilvl w:val="0"/>
+          <w:numId w:val="4"/>
+        </w:numPr>
+        <w:spacing w:after="80"/>
+      </w:pPr>
+      <w:r>
+        <w:t xml:space="preserve">Spin once for the first dancer, once for the second, and (if challenges are on) once for the couple's challenge.</w:t>
+      </w:r>
+    </w:p>
+    <w:p>
+      <w:pPr>
+        <w:pStyle w:val="ListParagraph"/>
+        <w:numPr>
+          <w:ilvl w:val="0"/>
+          <w:numId w:val="4"/>
+        </w:numPr>
+        <w:spacing w:after="80"/>
+      </w:pPr>
+      <w:r>
+        <w:t xml:space="preserve">While the couple dances, the screen holds on their names and challenge. Press and hold "Next couple" when they are done. It is a hold on purpose, so a pocket cannot trigger it.</w:t>
+      </w:r>
+    </w:p>
+    <w:p>
+      <w:pPr>
+        <w:pStyle w:val="ListParagraph"/>
+        <w:numPr>
+          <w:ilvl w:val="0"/>
+          <w:numId w:val="4"/>
+        </w:numPr>
+        <w:spacing w:after="80"/>
+      </w:pPr>
+      <w:r>
+        <w:t xml:space="preserve">Undo steps back one action at a time and tells you what it will undo first. The back gesture opens it too.</w:t>
+      </w:r>
+    </w:p>
+    <w:p>
+      <w:pPr>
+        <w:pStyle w:val="ListParagraph"/>
+        <w:numPr>
+          <w:ilvl w:val="0"/>
+          <w:numId w:val="4"/>
+        </w:numPr>
+        <w:spacing w:after="80"/>
+      </w:pPr>
+      <w:r>
+        <w:t xml:space="preserve">Tools lets you re-spin a dancer, redraw a challenge, add a late arrival, or see who has danced.</w:t>
+      </w:r>
+    </w:p>
+    <w:p>
+      <w:pPr>
+        <w:pStyle w:val="ListParagraph"/>
+        <w:numPr>
+          <w:ilvl w:val="0"/>
+          <w:numId w:val="4"/>
+        </w:numPr>
+        <w:spacing w:after="80"/>
+      </w:pPr>
+      <w:r>
+        <w:t xml:space="preserve">Lock freezes the screen before it goes in a pocket. Hold to unlock.</w:t>
+      </w:r>
+    </w:p>
+    <w:p>
+      <w:pPr>
+        <w:pStyle w:val="ListParagraph"/>
+        <w:numPr>
+          <w:ilvl w:val="0"/>
+          <w:numId w:val="4"/>
+        </w:numPr>
+        <w:spacing w:after="80"/>
+      </w:pPr>
+      <w:r>
+        <w:t xml:space="preserve">Nobody sits out and no couple repeats: if one side runs short, those dancers go round again with someone new.</w:t>
+      </w:r>
+    </w:p>
+    <w:p>
+      <w:pPr>
+        <w:pStyle w:val="ListParagraph"/>
+        <w:numPr>
+          <w:ilvl w:val="0"/>
+          <w:numId w:val="4"/>
+        </w:numPr>
+        <w:spacing w:after="80"/>
+      </w:pPr>
+      <w:r>
+        <w:t xml:space="preserve">Handing the device to someone else is fine. It always carries on exactly where it was left, even after a dead battery.</w:t>
       </w:r>
     </w:p>
     <w:p>
@@ -254,59 +429,89 @@
         <w:spacing w:after="100" w:before="200"/>
       </w:pPr>
       <w:r>
-        <w:t xml:space="preserve">Setting up</w:t>
-      </w:r>
-    </w:p>
-    <w:p>
-      <w:pPr>
-        <w:pStyle w:val="ListParagraph"/>
-        <w:numPr>
-          <w:ilvl w:val="0"/>
-          <w:numId w:val="5"/>
-        </w:numPr>
-        <w:spacing w:after="80"/>
-      </w:pPr>
-      <w:r>
-        <w:t xml:space="preserve">Tap Start a Session.</w:t>
-      </w:r>
-    </w:p>
-    <w:p>
-      <w:pPr>
-        <w:pStyle w:val="ListParagraph"/>
-        <w:numPr>
-          <w:ilvl w:val="0"/>
-          <w:numId w:val="5"/>
-        </w:numPr>
-        <w:spacing w:after="80"/>
-      </w:pPr>
-      <w:r>
-        <w:t xml:space="preserve">Dancers: add everyone and mark each as Leader, Follower or Switch. Switches are shared out to keep both sides even. Names need a last initial ("Sarah M"). Roughly 3 to 10 couples works best; 5 is the sweet spot.</w:t>
-      </w:r>
-    </w:p>
-    <w:p>
-      <w:pPr>
-        <w:pStyle w:val="ListParagraph"/>
-        <w:numPr>
-          <w:ilvl w:val="0"/>
-          <w:numId w:val="5"/>
-        </w:numPr>
-        <w:spacing w:after="80"/>
-      </w:pPr>
-      <w:r>
-        <w:t xml:space="preserve">How it runs: choose who is drawn first (leaders, followers, or let the app decide) and whether each couple gets a challenge.</w:t>
-      </w:r>
-    </w:p>
-    <w:p>
-      <w:pPr>
-        <w:pStyle w:val="ListParagraph"/>
-        <w:numPr>
-          <w:ilvl w:val="0"/>
-          <w:numId w:val="5"/>
-        </w:numPr>
-        <w:spacing w:after="80"/>
-      </w:pPr>
-      <w:r>
-        <w:t xml:space="preserve">Start: check the summary, then begin. Use Change next to anything that looks wrong.</w:t>
+        <w:t xml:space="preserve">Ending the night</w:t>
+      </w:r>
+    </w:p>
+    <w:p>
+      <w:pPr>
+        <w:spacing w:after="120"/>
+      </w:pPr>
+      <w:r>
+        <w:t xml:space="preserve">When everyone has danced, you can Crown a Winner (pick the couple, bring down the curtain, hold to reveal), run an AllSkate (one last challenge for the whole floor), do both, or neither. The finished night shows everyone who danced.</w:t>
+      </w:r>
+    </w:p>
+    <w:p>
+      <w:pPr>
+        <w:pStyle w:val="Heading1"/>
+        <w:spacing w:after="120" w:before="320"/>
+      </w:pPr>
+      <w:r>
+        <w:t xml:space="preserve">Part 4: Run a practice on the Quick list</w:t>
+      </w:r>
+    </w:p>
+    <w:p>
+      <w:pPr>
+        <w:pStyle w:val="ListParagraph"/>
+        <w:numPr>
+          <w:ilvl w:val="0"/>
+          <w:numId w:val="4"/>
+        </w:numPr>
+        <w:spacing w:after="80"/>
+      </w:pPr>
+      <w:r>
+        <w:t xml:space="preserve">Every pairing appears at once, numbered. Send up one couple at a time or the whole floor; the list just keeps the order.</w:t>
+      </w:r>
+    </w:p>
+    <w:p>
+      <w:pPr>
+        <w:pStyle w:val="ListParagraph"/>
+        <w:numPr>
+          <w:ilvl w:val="0"/>
+          <w:numId w:val="4"/>
+        </w:numPr>
+        <w:spacing w:after="80"/>
+      </w:pPr>
+      <w:r>
+        <w:t xml:space="preserve">Tap a couple once they have danced. Danced couples are locked in place.</w:t>
+      </w:r>
+    </w:p>
+    <w:p>
+      <w:pPr>
+        <w:pStyle w:val="ListParagraph"/>
+        <w:numPr>
+          <w:ilvl w:val="0"/>
+          <w:numId w:val="4"/>
+        </w:numPr>
+        <w:spacing w:after="80"/>
+      </w:pPr>
+      <w:r>
+        <w:t xml:space="preserve">Reshuffle gives new pairings to everyone still to dance. Nobody who has danced moves.</w:t>
+      </w:r>
+    </w:p>
+    <w:p>
+      <w:pPr>
+        <w:pStyle w:val="ListParagraph"/>
+        <w:numPr>
+          <w:ilvl w:val="0"/>
+          <w:numId w:val="4"/>
+        </w:numPr>
+        <w:spacing w:after="80"/>
+      </w:pPr>
+      <w:r>
+        <w:t xml:space="preserve">Late arrival adds someone. Someone left takes a dancer off tonight's list (your saved dancers keep them). Change pairs anyone with anyone by hand.</w:t>
+      </w:r>
+    </w:p>
+    <w:p>
+      <w:pPr>
+        <w:pStyle w:val="ListParagraph"/>
+        <w:numPr>
+          <w:ilvl w:val="0"/>
+          <w:numId w:val="4"/>
+        </w:numPr>
+        <w:spacing w:after="80"/>
+      </w:pPr>
+      <w:r>
+        <w:t xml:space="preserve">Nobody dances twice in a row when someone else could go.</w:t>
       </w:r>
     </w:p>
     <w:p>
@@ -315,163 +520,46 @@
         <w:spacing w:after="100" w:before="200"/>
       </w:pPr>
       <w:r>
-        <w:t xml:space="preserve">During the night</w:t>
-      </w:r>
-    </w:p>
-    <w:p>
-      <w:pPr>
-        <w:pStyle w:val="ListParagraph"/>
-        <w:numPr>
-          <w:ilvl w:val="0"/>
-          <w:numId w:val="4"/>
-        </w:numPr>
-        <w:spacing w:after="80"/>
-      </w:pPr>
-      <w:r>
-        <w:t xml:space="preserve">Tap the wheel to spin. Tap a spinning wheel to hurry it up; double-tap to skip straight to the answer.</w:t>
-      </w:r>
-    </w:p>
-    <w:p>
-      <w:pPr>
-        <w:pStyle w:val="ListParagraph"/>
-        <w:numPr>
-          <w:ilvl w:val="0"/>
-          <w:numId w:val="4"/>
-        </w:numPr>
-        <w:spacing w:after="80"/>
-      </w:pPr>
-      <w:r>
-        <w:t xml:space="preserve">Spin once for the first dancer, once for the second, and (if challenges are on) once for the couple's challenge.</w:t>
-      </w:r>
-    </w:p>
-    <w:p>
-      <w:pPr>
-        <w:pStyle w:val="ListParagraph"/>
-        <w:numPr>
-          <w:ilvl w:val="0"/>
-          <w:numId w:val="4"/>
-        </w:numPr>
-        <w:spacing w:after="80"/>
-      </w:pPr>
-      <w:r>
-        <w:t xml:space="preserve">While the couple dances, the screen holds on their names and challenge. Press and hold "Next couple" when they are done. It is a hold on purpose, so a pocket cannot trigger it.</w:t>
-      </w:r>
-    </w:p>
-    <w:p>
-      <w:pPr>
-        <w:pStyle w:val="ListParagraph"/>
-        <w:numPr>
-          <w:ilvl w:val="0"/>
-          <w:numId w:val="4"/>
-        </w:numPr>
-        <w:spacing w:after="80"/>
-      </w:pPr>
-      <w:r>
-        <w:t xml:space="preserve">Undo steps back one action and asks first. Tools lets you re-spin a dancer, redraw a challenge, add a late arrival, or see who has danced.</w:t>
-      </w:r>
-    </w:p>
-    <w:p>
-      <w:pPr>
-        <w:pStyle w:val="ListParagraph"/>
-        <w:numPr>
-          <w:ilvl w:val="0"/>
-          <w:numId w:val="4"/>
-        </w:numPr>
-        <w:spacing w:after="80"/>
-      </w:pPr>
-      <w:r>
-        <w:t xml:space="preserve">Lock freezes the screen for your pocket. Hold to unlock.</w:t>
-      </w:r>
-    </w:p>
-    <w:p>
-      <w:pPr>
-        <w:pStyle w:val="ListParagraph"/>
-        <w:numPr>
-          <w:ilvl w:val="0"/>
-          <w:numId w:val="4"/>
-        </w:numPr>
-        <w:spacing w:after="80"/>
-      </w:pPr>
-      <w:r>
-        <w:t xml:space="preserve">Nobody sits out and no couple repeats: if one side runs short, those dancers go round again with someone new.</w:t>
-      </w:r>
-    </w:p>
-    <w:p>
-      <w:pPr>
-        <w:pStyle w:val="ListParagraph"/>
-        <w:numPr>
-          <w:ilvl w:val="0"/>
-          <w:numId w:val="4"/>
-        </w:numPr>
-        <w:spacing w:after="80"/>
-      </w:pPr>
-      <w:r>
-        <w:t xml:space="preserve">Handing the device to someone else is fine. It always carries on exactly where it was left, even after a dead battery.</w:t>
-      </w:r>
-    </w:p>
-    <w:p>
-      <w:pPr>
-        <w:pStyle w:val="Heading2"/>
-        <w:spacing w:after="100" w:before="200"/>
-      </w:pPr>
-      <w:r>
-        <w:t xml:space="preserve">Ending the night</w:t>
-      </w:r>
-    </w:p>
-    <w:p>
-      <w:pPr>
-        <w:spacing w:after="120"/>
-      </w:pPr>
-      <w:r>
-        <w:t xml:space="preserve">When everyone has danced, you can Crown a Winner (pick the couple, then hold to reveal behind the curtain), run an AllSkate (one last challenge for the whole floor), do both, or neither.</w:t>
-      </w:r>
-    </w:p>
-    <w:p>
-      <w:pPr>
-        <w:pStyle w:val="Heading2"/>
-        <w:spacing w:after="100" w:before="200"/>
-      </w:pPr>
-      <w:r>
-        <w:t xml:space="preserve">More help, and a trick</w:t>
-      </w:r>
-    </w:p>
-    <w:p>
-      <w:pPr>
-        <w:pStyle w:val="ListParagraph"/>
-        <w:numPr>
-          <w:ilvl w:val="0"/>
-          <w:numId w:val="4"/>
-        </w:numPr>
-        <w:spacing w:after="80"/>
-      </w:pPr>
-      <w:r>
-        <w:t xml:space="preserve">On the title screen, "How it works" lists every feature in one line each. "Prompt Bank" lets you see, set aside, or switch between sets of challenges.</w:t>
-      </w:r>
-    </w:p>
-    <w:p>
-      <w:pPr>
-        <w:pStyle w:val="ListParagraph"/>
-        <w:numPr>
-          <w:ilvl w:val="0"/>
-          <w:numId w:val="4"/>
-        </w:numPr>
-        <w:spacing w:after="80"/>
-      </w:pPr>
-      <w:r>
-        <w:t xml:space="preserve">The app shows short one-time hints. To see them again, go to How it works, then The app, then "Show the tips again".</w:t>
-      </w:r>
-    </w:p>
-    <w:p>
-      <w:pPr>
-        <w:pStyle w:val="ListParagraph"/>
-        <w:numPr>
-          <w:ilvl w:val="0"/>
-          <w:numId w:val="4"/>
-        </w:numPr>
-        <w:spacing w:after="80"/>
-      </w:pPr>
-      <w:r>
-        <w:t xml:space="preserve">Long-press a dancer's name while setting up to mark a birthday. When they are drawn, the night stops for a birthday jam.</w:t>
+        <w:t xml:space="preserve">Divisions (optional)</w:t>
+      </w:r>
+    </w:p>
+    <w:p>
+      <w:pPr>
+        <w:pStyle w:val="ListParagraph"/>
+        <w:numPr>
+          <w:ilvl w:val="0"/>
+          <w:numId w:val="4"/>
+        </w:numPr>
+        <w:spacing w:after="80"/>
+      </w:pPr>
+      <w:r>
+        <w:t xml:space="preserve">Newcomer to Champions, one division for leading and one for following. Anyone left unset is matched as Novice, and the start screen says who.</w:t>
+      </w:r>
+    </w:p>
+    <w:p>
+      <w:pPr>
+        <w:pStyle w:val="ListParagraph"/>
+        <w:numPr>
+          <w:ilvl w:val="0"/>
+          <w:numId w:val="4"/>
+        </w:numPr>
+        <w:spacing w:after="80"/>
+      </w:pPr>
+      <w:r>
+        <w:t xml:space="preserve">Strict keeps every division to itself. Merge lets a division with nobody on one side dance one division down.</w:t>
+      </w:r>
+    </w:p>
+    <w:p>
+      <w:pPr>
+        <w:pStyle w:val="ListParagraph"/>
+        <w:numPr>
+          <w:ilvl w:val="0"/>
+          <w:numId w:val="4"/>
+        </w:numPr>
+        <w:spacing w:after="80"/>
+      </w:pPr>
+      <w:r>
+        <w:t xml:space="preserve">Divisions work on the wheel too: the first spin draws from everyone, the second shows only partners in the same division.</w:t>
       </w:r>
     </w:p>
     <w:p>
@@ -480,6 +568,54 @@
         <w:spacing w:after="120" w:before="320"/>
       </w:pPr>
       <w:r>
+        <w:t xml:space="preserve">More help, and a trick</w:t>
+      </w:r>
+    </w:p>
+    <w:p>
+      <w:pPr>
+        <w:pStyle w:val="ListParagraph"/>
+        <w:numPr>
+          <w:ilvl w:val="0"/>
+          <w:numId w:val="4"/>
+        </w:numPr>
+        <w:spacing w:after="80"/>
+      </w:pPr>
+      <w:r>
+        <w:t xml:space="preserve">On the title screen, "How it works" lists every feature in one line each. "Prompt Bank" lets you see, set aside, or switch between sets of challenges.</w:t>
+      </w:r>
+    </w:p>
+    <w:p>
+      <w:pPr>
+        <w:pStyle w:val="ListParagraph"/>
+        <w:numPr>
+          <w:ilvl w:val="0"/>
+          <w:numId w:val="4"/>
+        </w:numPr>
+        <w:spacing w:after="80"/>
+      </w:pPr>
+      <w:r>
+        <w:t xml:space="preserve">The app shows short one-time hints. To see them again before handing it to someone new, go to How it works, then The app, then "Show the tips again".</w:t>
+      </w:r>
+    </w:p>
+    <w:p>
+      <w:pPr>
+        <w:pStyle w:val="ListParagraph"/>
+        <w:numPr>
+          <w:ilvl w:val="0"/>
+          <w:numId w:val="4"/>
+        </w:numPr>
+        <w:spacing w:after="80"/>
+      </w:pPr>
+      <w:r>
+        <w:t xml:space="preserve">Press and hold a dancer's name while setting up to mark a birthday. When they are drawn, the night stops for a birthday jam.</w:t>
+      </w:r>
+    </w:p>
+    <w:p>
+      <w:pPr>
+        <w:pStyle w:val="Heading1"/>
+        <w:spacing w:after="120" w:before="320"/>
+      </w:pPr>
+      <w:r>
         <w:t xml:space="preserve">If something goes wrong</w:t>
       </w:r>
     </w:p>
@@ -527,7 +663,7 @@
         <w:spacing w:after="120"/>
       </w:pPr>
       <w:r>
-        <w:t xml:space="preserve">Questions or ideas? Tell Dakota. This is early, and feedback shapes it.</w:t>
+        <w:t xml:space="preserve">Questions or ideas? Tell Dakota. Feedback shapes what gets built next.</w:t>
       </w:r>
     </w:p>
     <w:sectPr>
@@ -797,6 +933,21 @@
     <w:name w:val="Normal"/>
     <w:qFormat/>
   </w:style>
+  <w:style w:type="table" w:styleId="TableNormal" w:default="true">
+    <w:name w:val="Normal Table"/>
+    <w:uiPriority w:val="99"/>
+    <w:semiHidden/>
+    <w:unhideWhenUsed/>
+    <w:tblPr>
+      <w:tblInd w:type="dxa" w:w="0"/>
+      <w:tblCellMar>
+        <w:top w:type="dxa" w:w="0"/>
+        <w:left w:type="dxa" w:w="108"/>
+        <w:bottom w:type="dxa" w:w="0"/>
+        <w:right w:type="dxa" w:w="108"/>
+      </w:tblCellMar>
+    </w:tblPr>
+  </w:style>
   <w:style w:type="paragraph" w:styleId="Heading3">
     <w:name w:val="Heading 3"/>
     <w:basedOn w:val="Normal"/>
@@ -851,6 +1002,139 @@
     <w:name w:val="List Paragraph"/>
     <w:basedOn w:val="Normal"/>
     <w:qFormat/>
+  </w:style>
+  <w:style w:type="paragraph" w:styleId="Caption">
+    <w:name w:val="caption"/>
+    <w:basedOn w:val="Normal"/>
+    <w:next w:val="Normal"/>
+    <w:uiPriority w:val="35"/>
+    <w:semiHidden/>
+    <w:unhideWhenUsed/>
+    <w:qFormat/>
+    <w:pPr>
+      <w:spacing w:after="200"/>
+    </w:pPr>
+    <w:rPr>
+      <w:i/>
+      <w:iCs/>
+      <w:color w:val="44546A" w:themeColor="dark2"/>
+      <w:sz w:val="18"/>
+      <w:szCs w:val="18"/>
+    </w:rPr>
+  </w:style>
+  <w:style w:type="paragraph" w:styleId="Bibliography">
+    <w:name w:val="Bibliography"/>
+    <w:basedOn w:val="Normal"/>
+    <w:next w:val="Normal"/>
+    <w:uiPriority w:val="37"/>
+    <w:unhideWhenUsed/>
+  </w:style>
+  <w:style w:type="paragraph" w:styleId="TOC1">
+    <w:name w:val="toc 1"/>
+    <w:basedOn w:val="Normal"/>
+    <w:next w:val="Normal"/>
+    <w:uiPriority w:val="39"/>
+    <w:semiHidden/>
+    <w:unhideWhenUsed/>
+    <w:pPr>
+      <w:spacing w:after="100"/>
+    </w:pPr>
+  </w:style>
+  <w:style w:type="paragraph" w:styleId="TOC2">
+    <w:name w:val="toc 2"/>
+    <w:basedOn w:val="Normal"/>
+    <w:next w:val="Normal"/>
+    <w:uiPriority w:val="39"/>
+    <w:semiHidden/>
+    <w:unhideWhenUsed/>
+    <w:pPr>
+      <w:spacing w:after="100"/>
+      <w:ind w:left="240"/>
+    </w:pPr>
+  </w:style>
+  <w:style w:type="paragraph" w:styleId="TOC3">
+    <w:name w:val="toc 3"/>
+    <w:basedOn w:val="Normal"/>
+    <w:next w:val="Normal"/>
+    <w:uiPriority w:val="39"/>
+    <w:semiHidden/>
+    <w:unhideWhenUsed/>
+    <w:pPr>
+      <w:spacing w:after="100"/>
+      <w:ind w:left="480"/>
+    </w:pPr>
+  </w:style>
+  <w:style w:type="paragraph" w:styleId="TOC4">
+    <w:name w:val="toc 4"/>
+    <w:basedOn w:val="Normal"/>
+    <w:next w:val="Normal"/>
+    <w:uiPriority w:val="39"/>
+    <w:semiHidden/>
+    <w:unhideWhenUsed/>
+    <w:pPr>
+      <w:spacing w:after="100"/>
+      <w:ind w:left="720"/>
+    </w:pPr>
+  </w:style>
+  <w:style w:type="paragraph" w:styleId="TOC5">
+    <w:name w:val="toc 5"/>
+    <w:basedOn w:val="Normal"/>
+    <w:next w:val="Normal"/>
+    <w:uiPriority w:val="39"/>
+    <w:semiHidden/>
+    <w:unhideWhenUsed/>
+    <w:pPr>
+      <w:spacing w:after="100"/>
+      <w:ind w:left="960"/>
+    </w:pPr>
+  </w:style>
+  <w:style w:type="paragraph" w:styleId="TOC6">
+    <w:name w:val="toc 6"/>
+    <w:basedOn w:val="Normal"/>
+    <w:next w:val="Normal"/>
+    <w:uiPriority w:val="39"/>
+    <w:semiHidden/>
+    <w:unhideWhenUsed/>
+    <w:pPr>
+      <w:spacing w:after="100"/>
+      <w:ind w:left="1200"/>
+    </w:pPr>
+  </w:style>
+  <w:style w:type="paragraph" w:styleId="TOC7">
+    <w:name w:val="toc 7"/>
+    <w:basedOn w:val="Normal"/>
+    <w:next w:val="Normal"/>
+    <w:uiPriority w:val="39"/>
+    <w:semiHidden/>
+    <w:unhideWhenUsed/>
+    <w:pPr>
+      <w:spacing w:after="100"/>
+      <w:ind w:left="1440"/>
+    </w:pPr>
+  </w:style>
+  <w:style w:type="paragraph" w:styleId="TOC8">
+    <w:name w:val="toc 8"/>
+    <w:basedOn w:val="Normal"/>
+    <w:next w:val="Normal"/>
+    <w:uiPriority w:val="39"/>
+    <w:semiHidden/>
+    <w:unhideWhenUsed/>
+    <w:pPr>
+      <w:spacing w:after="100"/>
+      <w:ind w:left="1680"/>
+    </w:pPr>
+  </w:style>
+  <w:style w:type="paragraph" w:styleId="TOC9">
+    <w:name w:val="toc 9"/>
+    <w:basedOn w:val="Normal"/>
+    <w:next w:val="Normal"/>
+    <w:uiPriority w:val="39"/>
+    <w:semiHidden/>
+    <w:unhideWhenUsed/>
+    <w:pPr>
+      <w:spacing w:after="100"/>
+      <w:ind w:left="1920"/>
+    </w:pPr>
   </w:style>
   <w:style w:type="character" w:styleId="Hyperlink">
     <w:name w:val="Hyperlink"/>
@@ -935,6 +1219,13 @@
       <w:sz w:val="20"/>
       <w:szCs w:val="20"/>
     </w:rPr>
+  </w:style>
+  <w:style w:type="character" w:styleId="LineNumber">
+    <w:name w:val="line number"/>
+    <w:basedOn w:val="DefaultParagraphFont"/>
+    <w:uiPriority w:val="99"/>
+    <w:semiHidden/>
+    <w:unhideWhenUsed/>
   </w:style>
   <w:style w:type="paragraph" w:styleId="Title">
     <w:name w:val="Title"/>

</xml_diff>